<commit_message>
Rick e Renner: revisão da Parte 5
Co-Authored-By: Claude Opus 5.5 <noreply@anthropic.com>
Claude-Session: https://claude.ai/code/session_01MJjUEEZrxQDEUifKK2vj9g
</commit_message>
<xml_diff>
--- a/roteiros/rick-e-renner/RickRenner_Parte5.docx
+++ b/roteiros/rick-e-renner/RickRenner_Parte5.docx
@@ -135,7 +135,7 @@
         <w:rPr>
           <w:color w:val="000000"/>
         </w:rPr>
-        <w:t>Vinte e cinco anos depois, Rick cantava aquela mesma música numa outra festa de quinze anos, para a filha de outro pai.</w:t>
+        <w:t>Vinte e cinco anos depois de gravá-la, Rick cantava aquela mesma música numa outra festa de quinze anos, para a filha de outro pai.</w:t>
       </w:r>
     </w:p>
     <w:p>
@@ -319,7 +319,7 @@
         <w:rPr>
           <w:color w:val="000000"/>
         </w:rPr>
-        <w:t>No fim da tarde, quando chegou a hora do enterro, Renner segurou uma das alças do caixão. Ao lado dele estavam Victor, filho de Rick, e Marcos, genro do cantor.</w:t>
+        <w:t>À tarde, quando chegou a hora do enterro, Renner segurou uma das alças do caixão. Ao lado dele estavam Victor, filho de Rick, e Marcos, genro do cantor.</w:t>
       </w:r>
     </w:p>
     <w:p>
@@ -503,7 +503,7 @@
         <w:rPr>
           <w:color w:val="000000"/>
         </w:rPr>
-        <w:t>Rick escreveu que a vida estava passando depressa. Estava certo. E, mesmo assim, escolheu passar o tempo que restava ao lado de quem tantas vezes o decepcionou.</w:t>
+        <w:t>Rick escreveu que a vida estava passando depressa. Estava certo. E, mesmo assim, escolheu passar o tempo que restava ao lado do parceiro que tantas vezes precisou perdoar.</w:t>
       </w:r>
     </w:p>
     <w:p>

</xml_diff>